<commit_message>
Set docx code blocks to 8pt left-aligned, drop bold from prose
The docx reference doc set jc=both in docDefaults, and Pandoc emits each code
block as a single Word paragraph with <w:br/> line breaks inside it, so Word
justified every line but the last and the spacing between tokens stretched
until the indentation no longer lined up. SourceCode now sets jc=left to
override the default, and carries a Consolas rPr it never had, which also
stops unhighlighted output blocks falling back to Times New Roman. All 33
code styles drop from 11pt to 8pt.

Strips 16 bold spans from prose in five chapters. Fenced code and inline code
spans were left alone. The only bold left in the rendered docx now comes from
11 unresolved citation keys in the terrain-hydrology and lidar chapters.

Also drops two build artifacts committed by mistake in bb06459, a stray
references/index.html and a Word owner file, plus a stale root-level docx and
a leftover .rmarkdown intermediate.
</commit_message>
<xml_diff>
--- a/references/style-formal.docx
+++ b/references/style-formal.docx
@@ -12372,7 +12372,8 @@
     <w:link w:val="SourceCode"/>
     <w:rPr>
       <w:rFonts w:ascii="Consolas" w:hAnsi="Consolas"/>
-      <w:sz w:val="22"/>
+      <w:sz w:val="16"/>
+      <w:szCs w:val="16"/>
     </w:rPr>
   </w:style>
   <w:style w:type="character" w:customStyle="1" w:styleId="SectionNumber">
@@ -12415,7 +12416,13 @@
     <w:pPr>
       <w:shd w:val="clear" w:color="auto" w:fill="F8F8F8"/>
       <w:wordWrap w:val="0"/>
+      <w:jc w:val="left"/>
     </w:pPr>
+    <w:rPr>
+      <w:rFonts w:ascii="Consolas" w:hAnsi="Consolas"/>
+      <w:sz w:val="16"/>
+      <w:szCs w:val="16"/>
+    </w:rPr>
   </w:style>
   <w:style w:type="character" w:customStyle="1" w:styleId="KeywordTok">
     <w:name w:val="KeywordTok"/>
@@ -12424,7 +12431,8 @@
       <w:rFonts w:ascii="Consolas" w:hAnsi="Consolas"/>
       <w:b/>
       <w:color w:val="204A87"/>
-      <w:sz w:val="22"/>
+      <w:sz w:val="16"/>
+      <w:szCs w:val="16"/>
       <w:shd w:val="clear" w:color="auto" w:fill="F8F8F8"/>
     </w:rPr>
   </w:style>
@@ -12434,7 +12442,8 @@
     <w:rPr>
       <w:rFonts w:ascii="Consolas" w:hAnsi="Consolas"/>
       <w:color w:val="204A87"/>
-      <w:sz w:val="22"/>
+      <w:sz w:val="16"/>
+      <w:szCs w:val="16"/>
       <w:shd w:val="clear" w:color="auto" w:fill="F8F8F8"/>
     </w:rPr>
   </w:style>
@@ -12444,7 +12453,8 @@
     <w:rPr>
       <w:rFonts w:ascii="Consolas" w:hAnsi="Consolas"/>
       <w:color w:val="0000CF"/>
-      <w:sz w:val="22"/>
+      <w:sz w:val="16"/>
+      <w:szCs w:val="16"/>
       <w:shd w:val="clear" w:color="auto" w:fill="F8F8F8"/>
     </w:rPr>
   </w:style>
@@ -12454,7 +12464,8 @@
     <w:rPr>
       <w:rFonts w:ascii="Consolas" w:hAnsi="Consolas"/>
       <w:color w:val="0000CF"/>
-      <w:sz w:val="22"/>
+      <w:sz w:val="16"/>
+      <w:szCs w:val="16"/>
       <w:shd w:val="clear" w:color="auto" w:fill="F8F8F8"/>
     </w:rPr>
   </w:style>
@@ -12464,7 +12475,8 @@
     <w:rPr>
       <w:rFonts w:ascii="Consolas" w:hAnsi="Consolas"/>
       <w:color w:val="0000CF"/>
-      <w:sz w:val="22"/>
+      <w:sz w:val="16"/>
+      <w:szCs w:val="16"/>
       <w:shd w:val="clear" w:color="auto" w:fill="F8F8F8"/>
     </w:rPr>
   </w:style>
@@ -12474,7 +12486,8 @@
     <w:rPr>
       <w:rFonts w:ascii="Consolas" w:hAnsi="Consolas"/>
       <w:color w:val="8F5902"/>
-      <w:sz w:val="22"/>
+      <w:sz w:val="16"/>
+      <w:szCs w:val="16"/>
       <w:shd w:val="clear" w:color="auto" w:fill="F8F8F8"/>
     </w:rPr>
   </w:style>
@@ -12484,7 +12497,8 @@
     <w:rPr>
       <w:rFonts w:ascii="Consolas" w:hAnsi="Consolas"/>
       <w:color w:val="4E9A06"/>
-      <w:sz w:val="22"/>
+      <w:sz w:val="16"/>
+      <w:szCs w:val="16"/>
       <w:shd w:val="clear" w:color="auto" w:fill="F8F8F8"/>
     </w:rPr>
   </w:style>
@@ -12495,7 +12509,8 @@
       <w:rFonts w:ascii="Consolas" w:hAnsi="Consolas"/>
       <w:b/>
       <w:color w:val="CE5C00"/>
-      <w:sz w:val="22"/>
+      <w:sz w:val="16"/>
+      <w:szCs w:val="16"/>
       <w:shd w:val="clear" w:color="auto" w:fill="F8F8F8"/>
     </w:rPr>
   </w:style>
@@ -12505,7 +12520,8 @@
     <w:rPr>
       <w:rFonts w:ascii="Consolas" w:hAnsi="Consolas"/>
       <w:color w:val="4E9A06"/>
-      <w:sz w:val="22"/>
+      <w:sz w:val="16"/>
+      <w:szCs w:val="16"/>
       <w:shd w:val="clear" w:color="auto" w:fill="F8F8F8"/>
     </w:rPr>
   </w:style>
@@ -12515,7 +12531,8 @@
     <w:rPr>
       <w:rFonts w:ascii="Consolas" w:hAnsi="Consolas"/>
       <w:color w:val="4E9A06"/>
-      <w:sz w:val="22"/>
+      <w:sz w:val="16"/>
+      <w:szCs w:val="16"/>
       <w:shd w:val="clear" w:color="auto" w:fill="F8F8F8"/>
     </w:rPr>
   </w:style>
@@ -12525,7 +12542,8 @@
     <w:rPr>
       <w:rFonts w:ascii="Consolas" w:hAnsi="Consolas"/>
       <w:color w:val="4E9A06"/>
-      <w:sz w:val="22"/>
+      <w:sz w:val="16"/>
+      <w:szCs w:val="16"/>
       <w:shd w:val="clear" w:color="auto" w:fill="F8F8F8"/>
     </w:rPr>
   </w:style>
@@ -12534,7 +12552,8 @@
     <w:basedOn w:val="VerbatimChar"/>
     <w:rPr>
       <w:rFonts w:ascii="Consolas" w:hAnsi="Consolas"/>
-      <w:sz w:val="22"/>
+      <w:sz w:val="16"/>
+      <w:szCs w:val="16"/>
       <w:shd w:val="clear" w:color="auto" w:fill="F8F8F8"/>
     </w:rPr>
   </w:style>
@@ -12545,7 +12564,8 @@
       <w:rFonts w:ascii="Consolas" w:hAnsi="Consolas"/>
       <w:i/>
       <w:color w:val="8F5902"/>
-      <w:sz w:val="22"/>
+      <w:sz w:val="16"/>
+      <w:szCs w:val="16"/>
       <w:shd w:val="clear" w:color="auto" w:fill="F8F8F8"/>
     </w:rPr>
   </w:style>
@@ -12557,7 +12577,8 @@
       <w:b/>
       <w:i/>
       <w:color w:val="8F5902"/>
-      <w:sz w:val="22"/>
+      <w:sz w:val="16"/>
+      <w:szCs w:val="16"/>
       <w:shd w:val="clear" w:color="auto" w:fill="F8F8F8"/>
     </w:rPr>
   </w:style>
@@ -12569,7 +12590,8 @@
       <w:b/>
       <w:i/>
       <w:color w:val="8F5902"/>
-      <w:sz w:val="22"/>
+      <w:sz w:val="16"/>
+      <w:szCs w:val="16"/>
       <w:shd w:val="clear" w:color="auto" w:fill="F8F8F8"/>
     </w:rPr>
   </w:style>
@@ -12581,7 +12603,8 @@
       <w:b/>
       <w:i/>
       <w:color w:val="8F5902"/>
-      <w:sz w:val="22"/>
+      <w:sz w:val="16"/>
+      <w:szCs w:val="16"/>
       <w:shd w:val="clear" w:color="auto" w:fill="F8F8F8"/>
     </w:rPr>
   </w:style>
@@ -12591,7 +12614,8 @@
     <w:rPr>
       <w:rFonts w:ascii="Consolas" w:hAnsi="Consolas"/>
       <w:color w:val="8F5902"/>
-      <w:sz w:val="22"/>
+      <w:sz w:val="16"/>
+      <w:szCs w:val="16"/>
       <w:shd w:val="clear" w:color="auto" w:fill="F8F8F8"/>
     </w:rPr>
   </w:style>
@@ -12602,7 +12626,8 @@
       <w:rFonts w:ascii="Consolas" w:hAnsi="Consolas"/>
       <w:b/>
       <w:color w:val="204A87"/>
-      <w:sz w:val="22"/>
+      <w:sz w:val="16"/>
+      <w:szCs w:val="16"/>
       <w:shd w:val="clear" w:color="auto" w:fill="F8F8F8"/>
     </w:rPr>
   </w:style>
@@ -12612,7 +12637,8 @@
     <w:rPr>
       <w:rFonts w:ascii="Consolas" w:hAnsi="Consolas"/>
       <w:color w:val="000000"/>
-      <w:sz w:val="22"/>
+      <w:sz w:val="16"/>
+      <w:szCs w:val="16"/>
       <w:shd w:val="clear" w:color="auto" w:fill="F8F8F8"/>
     </w:rPr>
   </w:style>
@@ -12623,7 +12649,8 @@
       <w:rFonts w:ascii="Consolas" w:hAnsi="Consolas"/>
       <w:b/>
       <w:color w:val="204A87"/>
-      <w:sz w:val="22"/>
+      <w:sz w:val="16"/>
+      <w:szCs w:val="16"/>
       <w:shd w:val="clear" w:color="auto" w:fill="F8F8F8"/>
     </w:rPr>
   </w:style>
@@ -12634,7 +12661,8 @@
       <w:rFonts w:ascii="Consolas" w:hAnsi="Consolas"/>
       <w:b/>
       <w:color w:val="CE5C00"/>
-      <w:sz w:val="22"/>
+      <w:sz w:val="16"/>
+      <w:szCs w:val="16"/>
       <w:shd w:val="clear" w:color="auto" w:fill="F8F8F8"/>
     </w:rPr>
   </w:style>
@@ -12643,7 +12671,8 @@
     <w:basedOn w:val="VerbatimChar"/>
     <w:rPr>
       <w:rFonts w:ascii="Consolas" w:hAnsi="Consolas"/>
-      <w:sz w:val="22"/>
+      <w:sz w:val="16"/>
+      <w:szCs w:val="16"/>
       <w:shd w:val="clear" w:color="auto" w:fill="F8F8F8"/>
     </w:rPr>
   </w:style>
@@ -12652,7 +12681,8 @@
     <w:basedOn w:val="VerbatimChar"/>
     <w:rPr>
       <w:rFonts w:ascii="Consolas" w:hAnsi="Consolas"/>
-      <w:sz w:val="22"/>
+      <w:sz w:val="16"/>
+      <w:szCs w:val="16"/>
       <w:shd w:val="clear" w:color="auto" w:fill="F8F8F8"/>
     </w:rPr>
   </w:style>
@@ -12663,7 +12693,8 @@
       <w:rFonts w:ascii="Consolas" w:hAnsi="Consolas"/>
       <w:i/>
       <w:color w:val="8F5902"/>
-      <w:sz w:val="22"/>
+      <w:sz w:val="16"/>
+      <w:szCs w:val="16"/>
       <w:shd w:val="clear" w:color="auto" w:fill="F8F8F8"/>
     </w:rPr>
   </w:style>
@@ -12673,7 +12704,8 @@
     <w:rPr>
       <w:rFonts w:ascii="Consolas" w:hAnsi="Consolas"/>
       <w:color w:val="204A87"/>
-      <w:sz w:val="22"/>
+      <w:sz w:val="16"/>
+      <w:szCs w:val="16"/>
       <w:shd w:val="clear" w:color="auto" w:fill="F8F8F8"/>
     </w:rPr>
   </w:style>
@@ -12682,7 +12714,8 @@
     <w:basedOn w:val="VerbatimChar"/>
     <w:rPr>
       <w:rFonts w:ascii="Consolas" w:hAnsi="Consolas"/>
-      <w:sz w:val="22"/>
+      <w:sz w:val="16"/>
+      <w:szCs w:val="16"/>
       <w:shd w:val="clear" w:color="auto" w:fill="F8F8F8"/>
     </w:rPr>
   </w:style>
@@ -12694,7 +12727,8 @@
       <w:b/>
       <w:i/>
       <w:color w:val="8F5902"/>
-      <w:sz w:val="22"/>
+      <w:sz w:val="16"/>
+      <w:szCs w:val="16"/>
       <w:shd w:val="clear" w:color="auto" w:fill="F8F8F8"/>
     </w:rPr>
   </w:style>
@@ -12706,7 +12740,8 @@
       <w:b/>
       <w:i/>
       <w:color w:val="8F5902"/>
-      <w:sz w:val="22"/>
+      <w:sz w:val="16"/>
+      <w:szCs w:val="16"/>
       <w:shd w:val="clear" w:color="auto" w:fill="F8F8F8"/>
     </w:rPr>
   </w:style>
@@ -12716,7 +12751,8 @@
     <w:rPr>
       <w:rFonts w:ascii="Consolas" w:hAnsi="Consolas"/>
       <w:color w:val="EF2929"/>
-      <w:sz w:val="22"/>
+      <w:sz w:val="16"/>
+      <w:szCs w:val="16"/>
       <w:shd w:val="clear" w:color="auto" w:fill="F8F8F8"/>
     </w:rPr>
   </w:style>
@@ -12727,7 +12763,8 @@
       <w:rFonts w:ascii="Consolas" w:hAnsi="Consolas"/>
       <w:b/>
       <w:color w:val="A40000"/>
-      <w:sz w:val="22"/>
+      <w:sz w:val="16"/>
+      <w:szCs w:val="16"/>
       <w:shd w:val="clear" w:color="auto" w:fill="F8F8F8"/>
     </w:rPr>
   </w:style>
@@ -12736,7 +12773,8 @@
     <w:basedOn w:val="VerbatimChar"/>
     <w:rPr>
       <w:rFonts w:ascii="Consolas" w:hAnsi="Consolas"/>
-      <w:sz w:val="22"/>
+      <w:sz w:val="16"/>
+      <w:szCs w:val="16"/>
       <w:shd w:val="clear" w:color="auto" w:fill="F8F8F8"/>
     </w:rPr>
   </w:style>

</xml_diff>